<commit_message>
Upload current full project state with presentation files
</commit_message>
<xml_diff>
--- a/OptoEML_SNB_Final .docx
+++ b/OptoEML_SNB_Final .docx
@@ -1,6 +1,6 @@
 
 <file path=word/document.xml><?xml version="1.0" encoding="utf-8"?>
-<w:document xmlns:wpc="http://schemas.microsoft.com/office/word/2010/wordprocessingCanvas" xmlns:cx="http://schemas.microsoft.com/office/drawing/2014/chartex" xmlns:cx1="http://schemas.microsoft.com/office/drawing/2015/9/8/chartex" xmlns:cx2="http://schemas.microsoft.com/office/drawing/2015/10/21/chartex" xmlns:cx3="http://schemas.microsoft.com/office/drawing/2016/5/9/chartex" xmlns:cx4="http://schemas.microsoft.com/office/drawing/2016/5/10/chartex" xmlns:cx5="http://schemas.microsoft.com/office/drawing/2016/5/11/chartex" xmlns:cx6="http://schemas.microsoft.com/office/drawing/2016/5/12/chartex" xmlns:cx7="http://schemas.microsoft.com/office/drawing/2016/5/13/chartex" xmlns:cx8="http://schemas.microsoft.com/office/drawing/2016/5/14/chartex" xmlns:mc="http://schemas.openxmlformats.org/markup-compatibility/2006" xmlns:aink="http://schemas.microsoft.com/office/drawing/2016/ink" xmlns:am3d="http://schemas.microsoft.com/office/drawing/2017/model3d" xmlns:o="urn:schemas-microsoft-com:office:office" xmlns:r="http://schemas.openxmlformats.org/officeDocument/2006/relationships" xmlns:m="http://schemas.openxmlformats.org/officeDocument/2006/math" xmlns:v="urn:schemas-microsoft-com:vml" xmlns:wp14="http://schemas.microsoft.com/office/word/2010/wordprocessingDrawing" xmlns:wp="http://schemas.openxmlformats.org/drawingml/2006/wordprocessingDrawing" xmlns:w10="urn:schemas-microsoft-com:office:word" xmlns:w="http://schemas.openxmlformats.org/wordprocessingml/2006/main" xmlns:w14="http://schemas.microsoft.com/office/word/2010/wordml" xmlns:w15="http://schemas.microsoft.com/office/word/2012/wordml" xmlns:w16cid="http://schemas.microsoft.com/office/word/2016/wordml/cid" xmlns:w16se="http://schemas.microsoft.com/office/word/2015/wordml/symex" xmlns:wpg="http://schemas.microsoft.com/office/word/2010/wordprocessingGroup" xmlns:wpi="http://schemas.microsoft.com/office/word/2010/wordprocessingInk" xmlns:wne="http://schemas.microsoft.com/office/word/2006/wordml" xmlns:wps="http://schemas.microsoft.com/office/word/2010/wordprocessingShape" mc:Ignorable="w14 w15 w16se w16cid wp14">
+<w:document xmlns:wpc="http://schemas.microsoft.com/office/word/2010/wordprocessingCanvas" xmlns:cx="http://schemas.microsoft.com/office/drawing/2014/chartex" xmlns:cx1="http://schemas.microsoft.com/office/drawing/2015/9/8/chartex" xmlns:cx2="http://schemas.microsoft.com/office/drawing/2015/10/21/chartex" xmlns:cx3="http://schemas.microsoft.com/office/drawing/2016/5/9/chartex" xmlns:cx4="http://schemas.microsoft.com/office/drawing/2016/5/10/chartex" xmlns:cx5="http://schemas.microsoft.com/office/drawing/2016/5/11/chartex" xmlns:cx6="http://schemas.microsoft.com/office/drawing/2016/5/12/chartex" xmlns:cx7="http://schemas.microsoft.com/office/drawing/2016/5/13/chartex" xmlns:cx8="http://schemas.microsoft.com/office/drawing/2016/5/14/chartex" xmlns:mc="http://schemas.openxmlformats.org/markup-compatibility/2006" xmlns:aink="http://schemas.microsoft.com/office/drawing/2016/ink" xmlns:am3d="http://schemas.microsoft.com/office/drawing/2017/model3d" xmlns:o="urn:schemas-microsoft-com:office:office" xmlns:oel="http://schemas.microsoft.com/office/2019/extlst" xmlns:r="http://schemas.openxmlformats.org/officeDocument/2006/relationships" xmlns:m="http://schemas.openxmlformats.org/officeDocument/2006/math" xmlns:v="urn:schemas-microsoft-com:vml" xmlns:wp14="http://schemas.microsoft.com/office/word/2010/wordprocessingDrawing" xmlns:wp="http://schemas.openxmlformats.org/drawingml/2006/wordprocessingDrawing" xmlns:w10="urn:schemas-microsoft-com:office:word" xmlns:w="http://schemas.openxmlformats.org/wordprocessingml/2006/main" xmlns:w14="http://schemas.microsoft.com/office/word/2010/wordml" xmlns:w15="http://schemas.microsoft.com/office/word/2012/wordml" xmlns:w16cex="http://schemas.microsoft.com/office/word/2018/wordml/cex" xmlns:w16cid="http://schemas.microsoft.com/office/word/2016/wordml/cid" xmlns:w16="http://schemas.microsoft.com/office/word/2018/wordml" xmlns:w16du="http://schemas.microsoft.com/office/word/2023/wordml/word16du" xmlns:w16sdtdh="http://schemas.microsoft.com/office/word/2020/wordml/sdtdatahash" xmlns:w16sdtfl="http://schemas.microsoft.com/office/word/2024/wordml/sdtformatlock" xmlns:w16se="http://schemas.microsoft.com/office/word/2015/wordml/symex" xmlns:wpg="http://schemas.microsoft.com/office/word/2010/wordprocessingGroup" xmlns:wpi="http://schemas.microsoft.com/office/word/2010/wordprocessingInk" xmlns:wne="http://schemas.microsoft.com/office/word/2006/wordml" xmlns:wps="http://schemas.microsoft.com/office/word/2010/wordprocessingShape" mc:Ignorable="w14 w15 w16se w16cid w16 w16cex w16sdtdh w16sdtfl w16du wp14">
   <w:body>
     <w:p>
       <w:pPr>
@@ -309,23 +309,7 @@
           <w:rFonts w:cs="Times New Roman"/>
           <w:color w:val="000000" w:themeColor="text1"/>
         </w:rPr>
-        <w:t>Fong-</w:t>
-      </w:r>
-      <w:proofErr w:type="spellStart"/>
-      <w:r>
-        <w:rPr>
-          <w:rFonts w:cs="Times New Roman"/>
-          <w:color w:val="000000" w:themeColor="text1"/>
-        </w:rPr>
-        <w:t>Shung</w:t>
-      </w:r>
-      <w:proofErr w:type="spellEnd"/>
-      <w:r>
-        <w:rPr>
-          <w:rFonts w:cs="Times New Roman"/>
-          <w:color w:val="000000" w:themeColor="text1"/>
-        </w:rPr>
-        <w:t xml:space="preserve"> Huang</w:t>
+        <w:t>Fong-Shung Huang</w:t>
       </w:r>
       <w:r>
         <w:rPr>
@@ -349,21 +333,12 @@
         </w:rPr>
         <w:br/>
       </w:r>
-      <w:proofErr w:type="spellStart"/>
-      <w:r>
-        <w:rPr>
-          <w:rFonts w:cs="Times New Roman"/>
-          <w:color w:val="000000" w:themeColor="text1"/>
-        </w:rPr>
-        <w:t>Shuei-Liong</w:t>
-      </w:r>
-      <w:proofErr w:type="spellEnd"/>
-      <w:r>
-        <w:rPr>
-          <w:rFonts w:cs="Times New Roman"/>
-          <w:color w:val="000000" w:themeColor="text1"/>
-        </w:rPr>
-        <w:t xml:space="preserve"> Lin</w:t>
+      <w:r>
+        <w:rPr>
+          <w:rFonts w:cs="Times New Roman"/>
+          <w:color w:val="000000" w:themeColor="text1"/>
+        </w:rPr>
+        <w:t>Shuei-Liong Lin</w:t>
       </w:r>
       <w:r>
         <w:rPr>
@@ -660,39 +635,7 @@
           <w:rFonts w:eastAsia="標楷體" w:cs="Times New Roman"/>
           <w:color w:val="000000" w:themeColor="text1"/>
         </w:rPr>
-        <w:t xml:space="preserve">Department of Mechatronics and Biomedical Engineering, Lee Kong </w:t>
-      </w:r>
-      <w:proofErr w:type="spellStart"/>
-      <w:r>
-        <w:rPr>
-          <w:rFonts w:eastAsia="標楷體" w:cs="Times New Roman"/>
-          <w:color w:val="000000" w:themeColor="text1"/>
-        </w:rPr>
-        <w:t>Chian</w:t>
-      </w:r>
-      <w:proofErr w:type="spellEnd"/>
-      <w:r>
-        <w:rPr>
-          <w:rFonts w:eastAsia="標楷體" w:cs="Times New Roman"/>
-          <w:color w:val="000000" w:themeColor="text1"/>
-        </w:rPr>
-        <w:t xml:space="preserve"> Faculty of Engineering and Science, </w:t>
-      </w:r>
-      <w:proofErr w:type="spellStart"/>
-      <w:r>
-        <w:rPr>
-          <w:rFonts w:eastAsia="標楷體" w:cs="Times New Roman"/>
-          <w:color w:val="000000" w:themeColor="text1"/>
-        </w:rPr>
-        <w:t>Universiti</w:t>
-      </w:r>
-      <w:proofErr w:type="spellEnd"/>
-      <w:r>
-        <w:rPr>
-          <w:rFonts w:eastAsia="標楷體" w:cs="Times New Roman"/>
-          <w:color w:val="000000" w:themeColor="text1"/>
-        </w:rPr>
-        <w:t xml:space="preserve"> </w:t>
+        <w:t xml:space="preserve">Department of Mechatronics and Biomedical Engineering, Lee Kong Chian Faculty of Engineering and Science, Universiti </w:t>
       </w:r>
       <w:proofErr w:type="spellStart"/>
       <w:r>
@@ -1263,25 +1206,7 @@
           <w:color w:val="000000" w:themeColor="text1"/>
           <w:szCs w:val="24"/>
         </w:rPr>
-        <w:t xml:space="preserve"> serum toxin analysis and the </w:t>
-      </w:r>
-      <w:proofErr w:type="spellStart"/>
-      <w:r>
-        <w:rPr>
-          <w:rFonts w:cs="Times New Roman"/>
-          <w:color w:val="000000" w:themeColor="text1"/>
-          <w:szCs w:val="24"/>
-        </w:rPr>
-        <w:t>Kt</w:t>
-      </w:r>
-      <w:proofErr w:type="spellEnd"/>
-      <w:r>
-        <w:rPr>
-          <w:rFonts w:cs="Times New Roman"/>
-          <w:color w:val="000000" w:themeColor="text1"/>
-          <w:szCs w:val="24"/>
-        </w:rPr>
-        <w:t xml:space="preserve">/V ratio </w:t>
+        <w:t xml:space="preserve"> serum toxin analysis and the Kt/V ratio </w:t>
       </w:r>
       <w:r>
         <w:rPr>
@@ -11922,10 +11847,7 @@
         </w:tc>
       </w:tr>
     </w:tbl>
-    <w:p>
-      <w:bookmarkStart w:id="5" w:name="_GoBack"/>
-      <w:bookmarkEnd w:id="5"/>
-    </w:p>
+    <w:p/>
     <w:p>
       <w:pPr>
         <w:pStyle w:val="3"/>
@@ -12191,7 +12113,7 @@
           <w:sz w:val="24"/>
           <w:szCs w:val="24"/>
         </w:rPr>
-        <w:t xml:space="preserve">Urea nitrogen, creatinine, uric acid, phosphorus, and potassium in the collected samples were measured using ADVIA Chemistry XPT (SIMENS </w:t>
+        <w:t xml:space="preserve">Urea nitrogen, creatinine, uric acid, phosphorus, and potassium in the collected samples were measured using ADVIA Chemistry XPT (SIMENS Healthineers, Munich, Germany). β2-microglobulin was measured using Chemiluminescence Immunoassay (CLIA) (DPC </w:t>
       </w:r>
       <w:proofErr w:type="spellStart"/>
       <w:r>
@@ -12201,7 +12123,7 @@
           <w:sz w:val="24"/>
           <w:szCs w:val="24"/>
         </w:rPr>
-        <w:t>Healthineers</w:t>
+        <w:t>Immulite</w:t>
       </w:r>
       <w:proofErr w:type="spellEnd"/>
       <w:r>
@@ -12211,7 +12133,7 @@
           <w:sz w:val="24"/>
           <w:szCs w:val="24"/>
         </w:rPr>
-        <w:t xml:space="preserve">, Munich, Germany). β2-microglobulin was measured using Chemiluminescence Immunoassay (CLIA) (DPC </w:t>
+        <w:t xml:space="preserve"> 2000 </w:t>
       </w:r>
       <w:proofErr w:type="spellStart"/>
       <w:r>
@@ -12221,7 +12143,7 @@
           <w:sz w:val="24"/>
           <w:szCs w:val="24"/>
         </w:rPr>
-        <w:t>Immulite</w:t>
+        <w:t>Xpi</w:t>
       </w:r>
       <w:proofErr w:type="spellEnd"/>
       <w:r>
@@ -12231,47 +12153,7 @@
           <w:sz w:val="24"/>
           <w:szCs w:val="24"/>
         </w:rPr>
-        <w:t xml:space="preserve"> 2000 </w:t>
-      </w:r>
-      <w:proofErr w:type="spellStart"/>
-      <w:r>
-        <w:rPr>
-          <w:bCs/>
-          <w:color w:val="000000" w:themeColor="text1"/>
-          <w:sz w:val="24"/>
-          <w:szCs w:val="24"/>
-        </w:rPr>
-        <w:t>Xpi</w:t>
-      </w:r>
-      <w:proofErr w:type="spellEnd"/>
-      <w:r>
-        <w:rPr>
-          <w:bCs/>
-          <w:color w:val="000000" w:themeColor="text1"/>
-          <w:sz w:val="24"/>
-          <w:szCs w:val="24"/>
-        </w:rPr>
-        <w:t xml:space="preserve">, SIMENS </w:t>
-      </w:r>
-      <w:proofErr w:type="spellStart"/>
-      <w:r>
-        <w:rPr>
-          <w:bCs/>
-          <w:color w:val="000000" w:themeColor="text1"/>
-          <w:sz w:val="24"/>
-          <w:szCs w:val="24"/>
-        </w:rPr>
-        <w:t>Healthineers</w:t>
-      </w:r>
-      <w:proofErr w:type="spellEnd"/>
-      <w:r>
-        <w:rPr>
-          <w:bCs/>
-          <w:color w:val="000000" w:themeColor="text1"/>
-          <w:sz w:val="24"/>
-          <w:szCs w:val="24"/>
-        </w:rPr>
-        <w:t>®, Munich, Germany). The flow rate of spent dialysate is controlled at 0-800 mL/min by the peristaltic pumps of the HD machine (Fresenius 4008S, Fresenius Medical Care</w:t>
+        <w:t>, SIMENS Healthineers®, Munich, Germany). The flow rate of spent dialysate is controlled at 0-800 mL/min by the peristaltic pumps of the HD machine (Fresenius 4008S, Fresenius Medical Care</w:t>
       </w:r>
       <w:r>
         <w:rPr>
@@ -12540,7 +12422,7 @@
           <w:lang w:eastAsia="zh-TW"/>
         </w:rPr>
       </w:pPr>
-      <w:bookmarkStart w:id="6" w:name="_Ref155103785"/>
+      <w:bookmarkStart w:id="5" w:name="_Ref155103785"/>
       <w:r>
         <w:rPr>
           <w:b/>
@@ -12590,7 +12472,7 @@
         </w:rPr>
         <w:fldChar w:fldCharType="end"/>
       </w:r>
-      <w:bookmarkEnd w:id="6"/>
+      <w:bookmarkEnd w:id="5"/>
       <w:r>
         <w:rPr>
           <w:rFonts w:eastAsiaTheme="minorEastAsia"/>
@@ -12829,7 +12711,7 @@
         <w:spacing w:after="120" w:line="360" w:lineRule="auto"/>
         <w:jc w:val="center"/>
       </w:pPr>
-      <w:bookmarkStart w:id="7" w:name="_Ref155104100"/>
+      <w:bookmarkStart w:id="6" w:name="_Ref155104100"/>
       <w:r>
         <w:rPr>
           <w:b/>
@@ -12867,7 +12749,7 @@
         </w:rPr>
         <w:fldChar w:fldCharType="end"/>
       </w:r>
-      <w:bookmarkEnd w:id="7"/>
+      <w:bookmarkEnd w:id="6"/>
       <w:r>
         <w:rPr>
           <w:rFonts w:cs="Times New Roman"/>
@@ -14697,7 +14579,7 @@
         <w:spacing w:after="120" w:line="360" w:lineRule="auto"/>
         <w:jc w:val="center"/>
       </w:pPr>
-      <w:bookmarkStart w:id="8" w:name="_Ref155124654"/>
+      <w:bookmarkStart w:id="7" w:name="_Ref155124654"/>
       <w:r>
         <w:rPr>
           <w:b/>
@@ -14735,7 +14617,7 @@
         </w:rPr>
         <w:fldChar w:fldCharType="end"/>
       </w:r>
-      <w:bookmarkEnd w:id="8"/>
+      <w:bookmarkEnd w:id="7"/>
       <w:r>
         <w:rPr>
           <w:rFonts w:cs="Times New Roman"/>
@@ -15258,7 +15140,7 @@
         <w:spacing w:after="120" w:line="360" w:lineRule="auto"/>
         <w:jc w:val="center"/>
       </w:pPr>
-      <w:bookmarkStart w:id="9" w:name="_Ref155390730"/>
+      <w:bookmarkStart w:id="8" w:name="_Ref155390730"/>
       <w:r>
         <w:rPr>
           <w:b/>
@@ -15296,7 +15178,7 @@
         </w:rPr>
         <w:fldChar w:fldCharType="end"/>
       </w:r>
-      <w:bookmarkEnd w:id="9"/>
+      <w:bookmarkEnd w:id="8"/>
       <w:r>
         <w:rPr>
           <w:rFonts w:cs="Times New Roman"/>
@@ -16110,7 +15992,6 @@
               <w:top w:val="single" w:sz="4" w:space="0" w:color="auto"/>
               <w:left w:val="single" w:sz="4" w:space="0" w:color="auto"/>
             </w:tcBorders>
-            <w:shd w:val="clear" w:color="auto" w:fill="auto"/>
           </w:tcPr>
           <w:p>
             <w:pPr>
@@ -16140,7 +16021,6 @@
             <w:tcBorders>
               <w:top w:val="single" w:sz="4" w:space="0" w:color="auto"/>
             </w:tcBorders>
-            <w:shd w:val="clear" w:color="auto" w:fill="auto"/>
           </w:tcPr>
           <w:p>
             <w:pPr>
@@ -16170,7 +16050,6 @@
             <w:tcBorders>
               <w:top w:val="single" w:sz="4" w:space="0" w:color="auto"/>
             </w:tcBorders>
-            <w:shd w:val="clear" w:color="auto" w:fill="auto"/>
           </w:tcPr>
           <w:p>
             <w:pPr>
@@ -18773,7 +18652,7 @@
         <w:spacing w:after="120" w:line="360" w:lineRule="auto"/>
         <w:jc w:val="center"/>
       </w:pPr>
-      <w:bookmarkStart w:id="10" w:name="_Ref155124030"/>
+      <w:bookmarkStart w:id="9" w:name="_Ref155124030"/>
       <w:r>
         <w:rPr>
           <w:b/>
@@ -18811,7 +18690,7 @@
         </w:rPr>
         <w:fldChar w:fldCharType="end"/>
       </w:r>
-      <w:bookmarkEnd w:id="10"/>
+      <w:bookmarkEnd w:id="9"/>
       <w:r>
         <w:rPr>
           <w:rFonts w:cs="Times New Roman"/>
@@ -22866,7 +22745,7 @@
         <w:spacing w:after="120" w:line="360" w:lineRule="auto"/>
         <w:jc w:val="center"/>
       </w:pPr>
-      <w:bookmarkStart w:id="11" w:name="_Ref155126039"/>
+      <w:bookmarkStart w:id="10" w:name="_Ref155126039"/>
       <w:r>
         <w:rPr>
           <w:b/>
@@ -22904,7 +22783,7 @@
         </w:rPr>
         <w:fldChar w:fldCharType="end"/>
       </w:r>
-      <w:bookmarkEnd w:id="11"/>
+      <w:bookmarkEnd w:id="10"/>
       <w:r>
         <w:rPr>
           <w:rFonts w:cs="Times New Roman"/>
@@ -25010,7 +24889,7 @@
           <w:szCs w:val="24"/>
         </w:rPr>
       </w:pPr>
-      <w:bookmarkStart w:id="12" w:name="_Ref155123958"/>
+      <w:bookmarkStart w:id="11" w:name="_Ref155123958"/>
       <w:r>
         <w:rPr>
           <w:b/>
@@ -25048,7 +24927,7 @@
         </w:rPr>
         <w:fldChar w:fldCharType="end"/>
       </w:r>
-      <w:bookmarkEnd w:id="12"/>
+      <w:bookmarkEnd w:id="11"/>
       <w:r>
         <w:rPr>
           <w:b/>
@@ -25548,7 +25427,7 @@
         <w:spacing w:after="120"/>
         <w:jc w:val="both"/>
       </w:pPr>
-      <w:bookmarkStart w:id="13" w:name="_Ref155124063"/>
+      <w:bookmarkStart w:id="12" w:name="_Ref155124063"/>
     </w:p>
     <w:p>
       <w:pPr>
@@ -25613,7 +25492,7 @@
         </w:rPr>
         <w:fldChar w:fldCharType="end"/>
       </w:r>
-      <w:bookmarkEnd w:id="13"/>
+      <w:bookmarkEnd w:id="12"/>
       <w:r>
         <w:rPr>
           <w:rFonts w:cs="Times New Roman"/>
@@ -29254,7 +29133,7 @@
           <w:lang w:val="en-MY"/>
         </w:rPr>
       </w:pPr>
-      <w:bookmarkStart w:id="14" w:name="OLE_LINK1"/>
+      <w:bookmarkStart w:id="13" w:name="OLE_LINK1"/>
       <w:r>
         <w:rPr>
           <w:rFonts w:cs="Times New Roman"/>
@@ -29757,7 +29636,7 @@
         </w:rPr>
       </w:pPr>
     </w:p>
-    <w:bookmarkEnd w:id="14"/>
+    <w:bookmarkEnd w:id="13"/>
     <w:p>
       <w:pPr>
         <w:pStyle w:val="2"/>
@@ -29983,7 +29862,7 @@
           <w:szCs w:val="24"/>
         </w:rPr>
       </w:pPr>
-      <w:bookmarkStart w:id="15" w:name="_Ref155124103"/>
+      <w:bookmarkStart w:id="14" w:name="_Ref155124103"/>
       <w:r>
         <w:rPr>
           <w:b/>
@@ -30021,7 +29900,7 @@
         </w:rPr>
         <w:fldChar w:fldCharType="end"/>
       </w:r>
-      <w:bookmarkEnd w:id="15"/>
+      <w:bookmarkEnd w:id="14"/>
       <w:r>
         <w:rPr>
           <w:b/>
@@ -30267,6 +30146,444 @@
           <w:sz w:val="22"/>
         </w:rPr>
         <w:lastRenderedPageBreak/>
+        <mc:AlternateContent>
+          <mc:Choice Requires="wps">
+            <w:drawing>
+              <wp:anchor distT="0" distB="0" distL="114300" distR="114300" simplePos="0" relativeHeight="251667456" behindDoc="0" locked="0" layoutInCell="1" allowOverlap="1" wp14:anchorId="09579402" wp14:editId="7F02FDED">
+                <wp:simplePos x="0" y="0"/>
+                <wp:positionH relativeFrom="column">
+                  <wp:posOffset>4343401</wp:posOffset>
+                </wp:positionH>
+                <wp:positionV relativeFrom="paragraph">
+                  <wp:posOffset>1715134</wp:posOffset>
+                </wp:positionV>
+                <wp:extent cx="2362200" cy="1713865"/>
+                <wp:effectExtent l="0" t="0" r="12700" b="13335"/>
+                <wp:wrapNone/>
+                <wp:docPr id="1586776268" name="直線接點 1"/>
+                <wp:cNvGraphicFramePr/>
+                <a:graphic xmlns:a="http://schemas.openxmlformats.org/drawingml/2006/main">
+                  <a:graphicData uri="http://schemas.microsoft.com/office/word/2010/wordprocessingShape">
+                    <wps:wsp>
+                      <wps:cNvCnPr/>
+                      <wps:spPr>
+                        <a:xfrm flipV="1">
+                          <a:off x="0" y="0"/>
+                          <a:ext cx="2362200" cy="1713865"/>
+                        </a:xfrm>
+                        <a:prstGeom prst="line">
+                          <a:avLst/>
+                        </a:prstGeom>
+                      </wps:spPr>
+                      <wps:style>
+                        <a:lnRef idx="1">
+                          <a:schemeClr val="accent1"/>
+                        </a:lnRef>
+                        <a:fillRef idx="0">
+                          <a:schemeClr val="accent1"/>
+                        </a:fillRef>
+                        <a:effectRef idx="0">
+                          <a:schemeClr val="accent1"/>
+                        </a:effectRef>
+                        <a:fontRef idx="minor">
+                          <a:schemeClr val="tx1"/>
+                        </a:fontRef>
+                      </wps:style>
+                      <wps:bodyPr/>
+                    </wps:wsp>
+                  </a:graphicData>
+                </a:graphic>
+                <wp14:sizeRelH relativeFrom="margin">
+                  <wp14:pctWidth>0</wp14:pctWidth>
+                </wp14:sizeRelH>
+                <wp14:sizeRelV relativeFrom="margin">
+                  <wp14:pctHeight>0</wp14:pctHeight>
+                </wp14:sizeRelV>
+              </wp:anchor>
+            </w:drawing>
+          </mc:Choice>
+          <mc:Fallback>
+            <w:pict>
+              <v:line w14:anchorId="25B0D5A6" id="直線接點 1" o:spid="_x0000_s1026" style="position:absolute;flip:y;z-index:251667456;visibility:visible;mso-wrap-style:square;mso-width-percent:0;mso-height-percent:0;mso-wrap-distance-left:9pt;mso-wrap-distance-top:0;mso-wrap-distance-right:9pt;mso-wrap-distance-bottom:0;mso-position-horizontal:absolute;mso-position-horizontal-relative:text;mso-position-vertical:absolute;mso-position-vertical-relative:text;mso-width-percent:0;mso-height-percent:0;mso-width-relative:margin;mso-height-relative:margin" from="342pt,135.05pt" to="528pt,270pt" o:gfxdata="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" strokecolor="#4472c4 [3204]" strokeweight=".5pt">
+                <v:stroke joinstyle="miter"/>
+              </v:line>
+            </w:pict>
+          </mc:Fallback>
+        </mc:AlternateContent>
+      </w:r>
+      <w:r>
+        <w:rPr>
+          <w:rFonts w:cs="Times New Roman"/>
+          <w:bCs/>
+          <w:noProof/>
+          <w:color w:val="000000" w:themeColor="text1"/>
+          <w:sz w:val="22"/>
+        </w:rPr>
+        <mc:AlternateContent>
+          <mc:Choice Requires="wps">
+            <w:drawing>
+              <wp:anchor distT="0" distB="0" distL="114300" distR="114300" simplePos="0" relativeHeight="251669504" behindDoc="0" locked="0" layoutInCell="1" allowOverlap="1" wp14:anchorId="3BD2BA7F" wp14:editId="5B273E01">
+                <wp:simplePos x="0" y="0"/>
+                <wp:positionH relativeFrom="column">
+                  <wp:posOffset>2136775</wp:posOffset>
+                </wp:positionH>
+                <wp:positionV relativeFrom="paragraph">
+                  <wp:posOffset>1826019</wp:posOffset>
+                </wp:positionV>
+                <wp:extent cx="2362090" cy="1713464"/>
+                <wp:effectExtent l="0" t="0" r="13335" b="13970"/>
+                <wp:wrapNone/>
+                <wp:docPr id="1712309711" name="直線接點 1"/>
+                <wp:cNvGraphicFramePr/>
+                <a:graphic xmlns:a="http://schemas.openxmlformats.org/drawingml/2006/main">
+                  <a:graphicData uri="http://schemas.microsoft.com/office/word/2010/wordprocessingShape">
+                    <wps:wsp>
+                      <wps:cNvCnPr/>
+                      <wps:spPr>
+                        <a:xfrm flipV="1">
+                          <a:off x="0" y="0"/>
+                          <a:ext cx="2362090" cy="1713464"/>
+                        </a:xfrm>
+                        <a:prstGeom prst="line">
+                          <a:avLst/>
+                        </a:prstGeom>
+                      </wps:spPr>
+                      <wps:style>
+                        <a:lnRef idx="1">
+                          <a:schemeClr val="accent1"/>
+                        </a:lnRef>
+                        <a:fillRef idx="0">
+                          <a:schemeClr val="accent1"/>
+                        </a:fillRef>
+                        <a:effectRef idx="0">
+                          <a:schemeClr val="accent1"/>
+                        </a:effectRef>
+                        <a:fontRef idx="minor">
+                          <a:schemeClr val="tx1"/>
+                        </a:fontRef>
+                      </wps:style>
+                      <wps:bodyPr/>
+                    </wps:wsp>
+                  </a:graphicData>
+                </a:graphic>
+                <wp14:sizeRelH relativeFrom="margin">
+                  <wp14:pctWidth>0</wp14:pctWidth>
+                </wp14:sizeRelH>
+                <wp14:sizeRelV relativeFrom="margin">
+                  <wp14:pctHeight>0</wp14:pctHeight>
+                </wp14:sizeRelV>
+              </wp:anchor>
+            </w:drawing>
+          </mc:Choice>
+          <mc:Fallback>
+            <w:pict>
+              <v:line w14:anchorId="0202919A" id="直線接點 1" o:spid="_x0000_s1026" style="position:absolute;flip:y;z-index:251669504;visibility:visible;mso-wrap-style:square;mso-width-percent:0;mso-height-percent:0;mso-wrap-distance-left:9pt;mso-wrap-distance-top:0;mso-wrap-distance-right:9pt;mso-wrap-distance-bottom:0;mso-position-horizontal:absolute;mso-position-horizontal-relative:text;mso-position-vertical:absolute;mso-position-vertical-relative:text;mso-width-percent:0;mso-height-percent:0;mso-width-relative:margin;mso-height-relative:margin" from="168.25pt,143.8pt" to="354.25pt,278.7pt" o:gfxdata="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" strokecolor="#4472c4 [3204]" strokeweight=".5pt">
+                <v:stroke joinstyle="miter"/>
+              </v:line>
+            </w:pict>
+          </mc:Fallback>
+        </mc:AlternateContent>
+      </w:r>
+      <w:r>
+        <w:rPr>
+          <w:rFonts w:cs="Times New Roman"/>
+          <w:bCs/>
+          <w:noProof/>
+          <w:color w:val="000000" w:themeColor="text1"/>
+          <w:sz w:val="22"/>
+        </w:rPr>
+        <mc:AlternateContent>
+          <mc:Choice Requires="wps">
+            <w:drawing>
+              <wp:anchor distT="0" distB="0" distL="114300" distR="114300" simplePos="0" relativeHeight="251665408" behindDoc="0" locked="0" layoutInCell="1" allowOverlap="1" wp14:anchorId="0D28FED2" wp14:editId="6E4B8304">
+                <wp:simplePos x="0" y="0"/>
+                <wp:positionH relativeFrom="column">
+                  <wp:posOffset>4193147</wp:posOffset>
+                </wp:positionH>
+                <wp:positionV relativeFrom="paragraph">
+                  <wp:posOffset>111548</wp:posOffset>
+                </wp:positionV>
+                <wp:extent cx="2362090" cy="1713464"/>
+                <wp:effectExtent l="0" t="0" r="13335" b="13970"/>
+                <wp:wrapNone/>
+                <wp:docPr id="1034345040" name="直線接點 1"/>
+                <wp:cNvGraphicFramePr/>
+                <a:graphic xmlns:a="http://schemas.openxmlformats.org/drawingml/2006/main">
+                  <a:graphicData uri="http://schemas.microsoft.com/office/word/2010/wordprocessingShape">
+                    <wps:wsp>
+                      <wps:cNvCnPr/>
+                      <wps:spPr>
+                        <a:xfrm flipV="1">
+                          <a:off x="0" y="0"/>
+                          <a:ext cx="2362090" cy="1713464"/>
+                        </a:xfrm>
+                        <a:prstGeom prst="line">
+                          <a:avLst/>
+                        </a:prstGeom>
+                      </wps:spPr>
+                      <wps:style>
+                        <a:lnRef idx="1">
+                          <a:schemeClr val="accent1"/>
+                        </a:lnRef>
+                        <a:fillRef idx="0">
+                          <a:schemeClr val="accent1"/>
+                        </a:fillRef>
+                        <a:effectRef idx="0">
+                          <a:schemeClr val="accent1"/>
+                        </a:effectRef>
+                        <a:fontRef idx="minor">
+                          <a:schemeClr val="tx1"/>
+                        </a:fontRef>
+                      </wps:style>
+                      <wps:bodyPr/>
+                    </wps:wsp>
+                  </a:graphicData>
+                </a:graphic>
+                <wp14:sizeRelH relativeFrom="margin">
+                  <wp14:pctWidth>0</wp14:pctWidth>
+                </wp14:sizeRelH>
+                <wp14:sizeRelV relativeFrom="margin">
+                  <wp14:pctHeight>0</wp14:pctHeight>
+                </wp14:sizeRelV>
+              </wp:anchor>
+            </w:drawing>
+          </mc:Choice>
+          <mc:Fallback>
+            <w:pict>
+              <v:line w14:anchorId="3485B7E0" id="直線接點 1" o:spid="_x0000_s1026" style="position:absolute;flip:y;z-index:251665408;visibility:visible;mso-wrap-style:square;mso-width-percent:0;mso-height-percent:0;mso-wrap-distance-left:9pt;mso-wrap-distance-top:0;mso-wrap-distance-right:9pt;mso-wrap-distance-bottom:0;mso-position-horizontal:absolute;mso-position-horizontal-relative:text;mso-position-vertical:absolute;mso-position-vertical-relative:text;mso-width-percent:0;mso-height-percent:0;mso-width-relative:margin;mso-height-relative:margin" from="330.15pt,8.8pt" to="516.15pt,143.7pt" o:gfxdata="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" strokecolor="#4472c4 [3204]" strokeweight=".5pt">
+                <v:stroke joinstyle="miter"/>
+              </v:line>
+            </w:pict>
+          </mc:Fallback>
+        </mc:AlternateContent>
+      </w:r>
+      <w:r>
+        <w:rPr>
+          <w:rFonts w:cs="Times New Roman"/>
+          <w:bCs/>
+          <w:noProof/>
+          <w:color w:val="000000" w:themeColor="text1"/>
+          <w:sz w:val="22"/>
+        </w:rPr>
+        <mc:AlternateContent>
+          <mc:Choice Requires="wps">
+            <w:drawing>
+              <wp:anchor distT="0" distB="0" distL="114300" distR="114300" simplePos="0" relativeHeight="251663360" behindDoc="0" locked="0" layoutInCell="1" allowOverlap="1" wp14:anchorId="75F77A58" wp14:editId="5FFB38B6">
+                <wp:simplePos x="0" y="0"/>
+                <wp:positionH relativeFrom="column">
+                  <wp:posOffset>2055525</wp:posOffset>
+                </wp:positionH>
+                <wp:positionV relativeFrom="paragraph">
+                  <wp:posOffset>153670</wp:posOffset>
+                </wp:positionV>
+                <wp:extent cx="2362090" cy="1713464"/>
+                <wp:effectExtent l="0" t="0" r="13335" b="13970"/>
+                <wp:wrapNone/>
+                <wp:docPr id="1283719924" name="直線接點 1"/>
+                <wp:cNvGraphicFramePr/>
+                <a:graphic xmlns:a="http://schemas.openxmlformats.org/drawingml/2006/main">
+                  <a:graphicData uri="http://schemas.microsoft.com/office/word/2010/wordprocessingShape">
+                    <wps:wsp>
+                      <wps:cNvCnPr/>
+                      <wps:spPr>
+                        <a:xfrm flipV="1">
+                          <a:off x="0" y="0"/>
+                          <a:ext cx="2362090" cy="1713464"/>
+                        </a:xfrm>
+                        <a:prstGeom prst="line">
+                          <a:avLst/>
+                        </a:prstGeom>
+                      </wps:spPr>
+                      <wps:style>
+                        <a:lnRef idx="1">
+                          <a:schemeClr val="accent1"/>
+                        </a:lnRef>
+                        <a:fillRef idx="0">
+                          <a:schemeClr val="accent1"/>
+                        </a:fillRef>
+                        <a:effectRef idx="0">
+                          <a:schemeClr val="accent1"/>
+                        </a:effectRef>
+                        <a:fontRef idx="minor">
+                          <a:schemeClr val="tx1"/>
+                        </a:fontRef>
+                      </wps:style>
+                      <wps:bodyPr/>
+                    </wps:wsp>
+                  </a:graphicData>
+                </a:graphic>
+                <wp14:sizeRelH relativeFrom="margin">
+                  <wp14:pctWidth>0</wp14:pctWidth>
+                </wp14:sizeRelH>
+                <wp14:sizeRelV relativeFrom="margin">
+                  <wp14:pctHeight>0</wp14:pctHeight>
+                </wp14:sizeRelV>
+              </wp:anchor>
+            </w:drawing>
+          </mc:Choice>
+          <mc:Fallback>
+            <w:pict>
+              <v:line w14:anchorId="2A1196D8" id="直線接點 1" o:spid="_x0000_s1026" style="position:absolute;flip:y;z-index:251663360;visibility:visible;mso-wrap-style:square;mso-width-percent:0;mso-height-percent:0;mso-wrap-distance-left:9pt;mso-wrap-distance-top:0;mso-wrap-distance-right:9pt;mso-wrap-distance-bottom:0;mso-position-horizontal:absolute;mso-position-horizontal-relative:text;mso-position-vertical:absolute;mso-position-vertical-relative:text;mso-width-percent:0;mso-height-percent:0;mso-width-relative:margin;mso-height-relative:margin" from="161.85pt,12.1pt" to="347.85pt,147pt" o:gfxdata="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" strokecolor="#4472c4 [3204]" strokeweight=".5pt">
+                <v:stroke joinstyle="miter"/>
+              </v:line>
+            </w:pict>
+          </mc:Fallback>
+        </mc:AlternateContent>
+      </w:r>
+      <w:r>
+        <w:rPr>
+          <w:rFonts w:cs="Times New Roman"/>
+          <w:bCs/>
+          <w:noProof/>
+          <w:color w:val="000000" w:themeColor="text1"/>
+          <w:sz w:val="22"/>
+        </w:rPr>
+        <mc:AlternateContent>
+          <mc:Choice Requires="wps">
+            <w:drawing>
+              <wp:anchor distT="0" distB="0" distL="114300" distR="114300" simplePos="0" relativeHeight="251661312" behindDoc="0" locked="0" layoutInCell="1" allowOverlap="1" wp14:anchorId="3AD56406" wp14:editId="19A882CF">
+                <wp:simplePos x="0" y="0"/>
+                <wp:positionH relativeFrom="column">
+                  <wp:posOffset>157155</wp:posOffset>
+                </wp:positionH>
+                <wp:positionV relativeFrom="paragraph">
+                  <wp:posOffset>1714958</wp:posOffset>
+                </wp:positionV>
+                <wp:extent cx="2362090" cy="1713464"/>
+                <wp:effectExtent l="0" t="0" r="13335" b="13970"/>
+                <wp:wrapNone/>
+                <wp:docPr id="1768326909" name="直線接點 1"/>
+                <wp:cNvGraphicFramePr/>
+                <a:graphic xmlns:a="http://schemas.openxmlformats.org/drawingml/2006/main">
+                  <a:graphicData uri="http://schemas.microsoft.com/office/word/2010/wordprocessingShape">
+                    <wps:wsp>
+                      <wps:cNvCnPr/>
+                      <wps:spPr>
+                        <a:xfrm flipV="1">
+                          <a:off x="0" y="0"/>
+                          <a:ext cx="2362090" cy="1713464"/>
+                        </a:xfrm>
+                        <a:prstGeom prst="line">
+                          <a:avLst/>
+                        </a:prstGeom>
+                      </wps:spPr>
+                      <wps:style>
+                        <a:lnRef idx="1">
+                          <a:schemeClr val="accent1"/>
+                        </a:lnRef>
+                        <a:fillRef idx="0">
+                          <a:schemeClr val="accent1"/>
+                        </a:fillRef>
+                        <a:effectRef idx="0">
+                          <a:schemeClr val="accent1"/>
+                        </a:effectRef>
+                        <a:fontRef idx="minor">
+                          <a:schemeClr val="tx1"/>
+                        </a:fontRef>
+                      </wps:style>
+                      <wps:bodyPr/>
+                    </wps:wsp>
+                  </a:graphicData>
+                </a:graphic>
+                <wp14:sizeRelH relativeFrom="margin">
+                  <wp14:pctWidth>0</wp14:pctWidth>
+                </wp14:sizeRelH>
+                <wp14:sizeRelV relativeFrom="margin">
+                  <wp14:pctHeight>0</wp14:pctHeight>
+                </wp14:sizeRelV>
+              </wp:anchor>
+            </w:drawing>
+          </mc:Choice>
+          <mc:Fallback>
+            <w:pict>
+              <v:line w14:anchorId="777E0B2E" id="直線接點 1" o:spid="_x0000_s1026" style="position:absolute;flip:y;z-index:251661312;visibility:visible;mso-wrap-style:square;mso-width-percent:0;mso-height-percent:0;mso-wrap-distance-left:9pt;mso-wrap-distance-top:0;mso-wrap-distance-right:9pt;mso-wrap-distance-bottom:0;mso-position-horizontal:absolute;mso-position-horizontal-relative:text;mso-position-vertical:absolute;mso-position-vertical-relative:text;mso-width-percent:0;mso-height-percent:0;mso-width-relative:margin;mso-height-relative:margin" from="12.35pt,135.05pt" to="198.35pt,269.95pt" o:gfxdata="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" strokecolor="#4472c4 [3204]" strokeweight=".5pt">
+                <v:stroke joinstyle="miter"/>
+              </v:line>
+            </w:pict>
+          </mc:Fallback>
+        </mc:AlternateContent>
+      </w:r>
+      <w:r>
+        <w:rPr>
+          <w:rFonts w:cs="Times New Roman"/>
+          <w:bCs/>
+          <w:noProof/>
+          <w:color w:val="000000" w:themeColor="text1"/>
+          <w:sz w:val="22"/>
+        </w:rPr>
+        <mc:AlternateContent>
+          <mc:Choice Requires="wps">
+            <w:drawing>
+              <wp:anchor distT="0" distB="0" distL="114300" distR="114300" simplePos="0" relativeHeight="251659264" behindDoc="0" locked="0" layoutInCell="1" allowOverlap="1" wp14:anchorId="3D7F390C" wp14:editId="7155EA53">
+                <wp:simplePos x="0" y="0"/>
+                <wp:positionH relativeFrom="column">
+                  <wp:posOffset>-152400</wp:posOffset>
+                </wp:positionH>
+                <wp:positionV relativeFrom="paragraph">
+                  <wp:posOffset>229635</wp:posOffset>
+                </wp:positionV>
+                <wp:extent cx="2362090" cy="1713464"/>
+                <wp:effectExtent l="0" t="0" r="13335" b="13970"/>
+                <wp:wrapNone/>
+                <wp:docPr id="1246930134" name="直線接點 1"/>
+                <wp:cNvGraphicFramePr/>
+                <a:graphic xmlns:a="http://schemas.openxmlformats.org/drawingml/2006/main">
+                  <a:graphicData uri="http://schemas.microsoft.com/office/word/2010/wordprocessingShape">
+                    <wps:wsp>
+                      <wps:cNvCnPr/>
+                      <wps:spPr>
+                        <a:xfrm flipV="1">
+                          <a:off x="0" y="0"/>
+                          <a:ext cx="2362090" cy="1713464"/>
+                        </a:xfrm>
+                        <a:prstGeom prst="line">
+                          <a:avLst/>
+                        </a:prstGeom>
+                      </wps:spPr>
+                      <wps:style>
+                        <a:lnRef idx="1">
+                          <a:schemeClr val="accent1"/>
+                        </a:lnRef>
+                        <a:fillRef idx="0">
+                          <a:schemeClr val="accent1"/>
+                        </a:fillRef>
+                        <a:effectRef idx="0">
+                          <a:schemeClr val="accent1"/>
+                        </a:effectRef>
+                        <a:fontRef idx="minor">
+                          <a:schemeClr val="tx1"/>
+                        </a:fontRef>
+                      </wps:style>
+                      <wps:bodyPr/>
+                    </wps:wsp>
+                  </a:graphicData>
+                </a:graphic>
+                <wp14:sizeRelH relativeFrom="margin">
+                  <wp14:pctWidth>0</wp14:pctWidth>
+                </wp14:sizeRelH>
+                <wp14:sizeRelV relativeFrom="margin">
+                  <wp14:pctHeight>0</wp14:pctHeight>
+                </wp14:sizeRelV>
+              </wp:anchor>
+            </w:drawing>
+          </mc:Choice>
+          <mc:Fallback>
+            <w:pict>
+              <v:line w14:anchorId="392A10EE" id="直線接點 1" o:spid="_x0000_s1026" style="position:absolute;flip:y;z-index:251659264;visibility:visible;mso-wrap-style:square;mso-width-percent:0;mso-height-percent:0;mso-wrap-distance-left:9pt;mso-wrap-distance-top:0;mso-wrap-distance-right:9pt;mso-wrap-distance-bottom:0;mso-position-horizontal:absolute;mso-position-horizontal-relative:text;mso-position-vertical:absolute;mso-position-vertical-relative:text;mso-width-percent:0;mso-height-percent:0;mso-width-relative:margin;mso-height-relative:margin" from="-12pt,18.1pt" to="174pt,153pt" o:gfxdata="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" strokecolor="#4472c4 [3204]" strokeweight=".5pt">
+                <v:stroke joinstyle="miter"/>
+              </v:line>
+            </w:pict>
+          </mc:Fallback>
+        </mc:AlternateContent>
+      </w:r>
+      <w:r>
+        <w:rPr>
+          <w:rFonts w:cs="Times New Roman"/>
+          <w:bCs/>
+          <w:noProof/>
+          <w:color w:val="000000" w:themeColor="text1"/>
+          <w:sz w:val="22"/>
+        </w:rPr>
         <w:drawing>
           <wp:inline distT="0" distB="0" distL="0" distR="0" wp14:anchorId="1CCD6FC4" wp14:editId="391BE8C5">
             <wp:extent cx="6467475" cy="3480179"/>
@@ -30330,7 +30647,7 @@
           <w:szCs w:val="24"/>
         </w:rPr>
       </w:pPr>
-      <w:bookmarkStart w:id="16" w:name="_Ref155124116"/>
+      <w:bookmarkStart w:id="15" w:name="_Ref155124116"/>
       <w:r>
         <w:rPr>
           <w:b/>
@@ -30368,7 +30685,7 @@
         </w:rPr>
         <w:fldChar w:fldCharType="end"/>
       </w:r>
-      <w:bookmarkEnd w:id="16"/>
+      <w:bookmarkEnd w:id="15"/>
       <w:r>
         <w:rPr>
           <w:b/>
@@ -31104,7 +31421,7 @@
           <w:szCs w:val="24"/>
         </w:rPr>
       </w:pPr>
-      <w:bookmarkStart w:id="17" w:name="_Ref155124087"/>
+      <w:bookmarkStart w:id="16" w:name="_Ref155124087"/>
       <w:r>
         <w:rPr>
           <w:b/>
@@ -31142,7 +31459,7 @@
         </w:rPr>
         <w:fldChar w:fldCharType="end"/>
       </w:r>
-      <w:bookmarkEnd w:id="17"/>
+      <w:bookmarkEnd w:id="16"/>
       <w:r>
         <w:rPr>
           <w:b/>
@@ -31630,7 +31947,7 @@
           <w:szCs w:val="24"/>
         </w:rPr>
       </w:pPr>
-      <w:bookmarkStart w:id="18" w:name="_Ref155434153"/>
+      <w:bookmarkStart w:id="17" w:name="_Ref155434153"/>
       <w:r>
         <w:rPr>
           <w:b/>
@@ -31668,7 +31985,7 @@
         </w:rPr>
         <w:fldChar w:fldCharType="end"/>
       </w:r>
-      <w:bookmarkEnd w:id="18"/>
+      <w:bookmarkEnd w:id="17"/>
       <w:r>
         <w:rPr>
           <w:b/>
@@ -31944,7 +32261,7 @@
           <w:szCs w:val="24"/>
         </w:rPr>
       </w:pPr>
-      <w:bookmarkStart w:id="19" w:name="_Ref155641790"/>
+      <w:bookmarkStart w:id="18" w:name="_Ref155641790"/>
       <w:r>
         <w:rPr>
           <w:b/>
@@ -31982,7 +32299,7 @@
         </w:rPr>
         <w:fldChar w:fldCharType="end"/>
       </w:r>
-      <w:bookmarkEnd w:id="19"/>
+      <w:bookmarkEnd w:id="18"/>
       <w:r>
         <w:rPr>
           <w:b/>
@@ -32159,27 +32476,7 @@
           <w:szCs w:val="24"/>
         </w:rPr>
         <w:lastRenderedPageBreak/>
-        <w:t xml:space="preserve">the monitoring of single pool </w:t>
-      </w:r>
-      <w:proofErr w:type="spellStart"/>
-      <w:r>
-        <w:rPr>
-          <w:rFonts w:cs="Times New Roman"/>
-          <w:bCs/>
-          <w:color w:val="000000" w:themeColor="text1"/>
-          <w:szCs w:val="24"/>
-        </w:rPr>
-        <w:t>Kt</w:t>
-      </w:r>
-      <w:proofErr w:type="spellEnd"/>
-      <w:r>
-        <w:rPr>
-          <w:rFonts w:cs="Times New Roman"/>
-          <w:bCs/>
-          <w:color w:val="000000" w:themeColor="text1"/>
-          <w:szCs w:val="24"/>
-        </w:rPr>
-        <w:t xml:space="preserve">/V in HD patients </w:t>
+        <w:t xml:space="preserve">the monitoring of single pool Kt/V in HD patients </w:t>
       </w:r>
       <w:r>
         <w:rPr>
@@ -32385,47 +32682,7 @@
           <w:color w:val="000000" w:themeColor="text1"/>
           <w:szCs w:val="24"/>
         </w:rPr>
-        <w:t xml:space="preserve">. While this research emphasized the potential enhancement of dialysis adequacy, it primarily concentrated on single-pool </w:t>
-      </w:r>
-      <w:proofErr w:type="spellStart"/>
-      <w:r>
-        <w:rPr>
-          <w:rFonts w:cs="Times New Roman"/>
-          <w:bCs/>
-          <w:color w:val="000000" w:themeColor="text1"/>
-          <w:szCs w:val="24"/>
-        </w:rPr>
-        <w:t>Kt</w:t>
-      </w:r>
-      <w:proofErr w:type="spellEnd"/>
-      <w:r>
-        <w:rPr>
-          <w:rFonts w:cs="Times New Roman"/>
-          <w:bCs/>
-          <w:color w:val="000000" w:themeColor="text1"/>
-          <w:szCs w:val="24"/>
-        </w:rPr>
-        <w:t xml:space="preserve">/V measurements. In contrast, our research takes a divergent approach by employing a multi-wavelength optoelectronic system to evaluate a broader spectrum of uremic toxins, including β2-microglobulin. This method allows for a more comprehensive assessment of HD treatment, encompassing not only single pool </w:t>
-      </w:r>
-      <w:proofErr w:type="spellStart"/>
-      <w:r>
-        <w:rPr>
-          <w:rFonts w:cs="Times New Roman"/>
-          <w:bCs/>
-          <w:color w:val="000000" w:themeColor="text1"/>
-          <w:szCs w:val="24"/>
-        </w:rPr>
-        <w:t>Kt</w:t>
-      </w:r>
-      <w:proofErr w:type="spellEnd"/>
-      <w:r>
-        <w:rPr>
-          <w:rFonts w:cs="Times New Roman"/>
-          <w:bCs/>
-          <w:color w:val="000000" w:themeColor="text1"/>
-          <w:szCs w:val="24"/>
-        </w:rPr>
-        <w:t>/V but also critical markers such as creatinine and β2-microglobulin. Consequently, our study provides a more in-depth insight into dialysis efficacy and the clearance of diverse toxins.</w:t>
+        <w:t>. While this research emphasized the potential enhancement of dialysis adequacy, it primarily concentrated on single-pool Kt/V measurements. In contrast, our research takes a divergent approach by employing a multi-wavelength optoelectronic system to evaluate a broader spectrum of uremic toxins, including β2-microglobulin. This method allows for a more comprehensive assessment of HD treatment, encompassing not only single pool Kt/V but also critical markers such as creatinine and β2-microglobulin. Consequently, our study provides a more in-depth insight into dialysis efficacy and the clearance of diverse toxins.</w:t>
       </w:r>
     </w:p>
     <w:p>
@@ -32752,7 +33009,6 @@
         </w:rPr>
         <w:t xml:space="preserve">During the preparation of this work the author(s) used </w:t>
       </w:r>
-      <w:proofErr w:type="spellStart"/>
       <w:r>
         <w:rPr>
           <w:rFonts w:cs="Times New Roman"/>
@@ -32762,7 +33018,6 @@
         </w:rPr>
         <w:t>ChatGPT</w:t>
       </w:r>
-      <w:proofErr w:type="spellEnd"/>
       <w:r>
         <w:rPr>
           <w:rFonts w:cs="Times New Roman"/>
@@ -35280,7 +35535,7 @@
 </file>
 
 <file path=word/endnotes.xml><?xml version="1.0" encoding="utf-8"?>
-<w:endnotes xmlns:wpc="http://schemas.microsoft.com/office/word/2010/wordprocessingCanvas" xmlns:cx="http://schemas.microsoft.com/office/drawing/2014/chartex" xmlns:cx1="http://schemas.microsoft.com/office/drawing/2015/9/8/chartex" xmlns:cx2="http://schemas.microsoft.com/office/drawing/2015/10/21/chartex" xmlns:cx3="http://schemas.microsoft.com/office/drawing/2016/5/9/chartex" xmlns:cx4="http://schemas.microsoft.com/office/drawing/2016/5/10/chartex" xmlns:cx5="http://schemas.microsoft.com/office/drawing/2016/5/11/chartex" xmlns:cx6="http://schemas.microsoft.com/office/drawing/2016/5/12/chartex" xmlns:cx7="http://schemas.microsoft.com/office/drawing/2016/5/13/chartex" xmlns:cx8="http://schemas.microsoft.com/office/drawing/2016/5/14/chartex" xmlns:mc="http://schemas.openxmlformats.org/markup-compatibility/2006" xmlns:aink="http://schemas.microsoft.com/office/drawing/2016/ink" xmlns:am3d="http://schemas.microsoft.com/office/drawing/2017/model3d" xmlns:o="urn:schemas-microsoft-com:office:office" xmlns:r="http://schemas.openxmlformats.org/officeDocument/2006/relationships" xmlns:m="http://schemas.openxmlformats.org/officeDocument/2006/math" xmlns:v="urn:schemas-microsoft-com:vml" xmlns:wp14="http://schemas.microsoft.com/office/word/2010/wordprocessingDrawing" xmlns:wp="http://schemas.openxmlformats.org/drawingml/2006/wordprocessingDrawing" xmlns:w10="urn:schemas-microsoft-com:office:word" xmlns:w="http://schemas.openxmlformats.org/wordprocessingml/2006/main" xmlns:w14="http://schemas.microsoft.com/office/word/2010/wordml" xmlns:w15="http://schemas.microsoft.com/office/word/2012/wordml" xmlns:w16cid="http://schemas.microsoft.com/office/word/2016/wordml/cid" xmlns:w16se="http://schemas.microsoft.com/office/word/2015/wordml/symex" xmlns:wpg="http://schemas.microsoft.com/office/word/2010/wordprocessingGroup" xmlns:wpi="http://schemas.microsoft.com/office/word/2010/wordprocessingInk" xmlns:wne="http://schemas.microsoft.com/office/word/2006/wordml" xmlns:wps="http://schemas.microsoft.com/office/word/2010/wordprocessingShape" mc:Ignorable="w14 w15 w16se w16cid wp14">
+<w:endnotes xmlns:wpc="http://schemas.microsoft.com/office/word/2010/wordprocessingCanvas" xmlns:cx="http://schemas.microsoft.com/office/drawing/2014/chartex" xmlns:cx1="http://schemas.microsoft.com/office/drawing/2015/9/8/chartex" xmlns:cx2="http://schemas.microsoft.com/office/drawing/2015/10/21/chartex" xmlns:cx3="http://schemas.microsoft.com/office/drawing/2016/5/9/chartex" xmlns:cx4="http://schemas.microsoft.com/office/drawing/2016/5/10/chartex" xmlns:cx5="http://schemas.microsoft.com/office/drawing/2016/5/11/chartex" xmlns:cx6="http://schemas.microsoft.com/office/drawing/2016/5/12/chartex" xmlns:cx7="http://schemas.microsoft.com/office/drawing/2016/5/13/chartex" xmlns:cx8="http://schemas.microsoft.com/office/drawing/2016/5/14/chartex" xmlns:mc="http://schemas.openxmlformats.org/markup-compatibility/2006" xmlns:aink="http://schemas.microsoft.com/office/drawing/2016/ink" xmlns:am3d="http://schemas.microsoft.com/office/drawing/2017/model3d" xmlns:o="urn:schemas-microsoft-com:office:office" xmlns:oel="http://schemas.microsoft.com/office/2019/extlst" xmlns:r="http://schemas.openxmlformats.org/officeDocument/2006/relationships" xmlns:m="http://schemas.openxmlformats.org/officeDocument/2006/math" xmlns:v="urn:schemas-microsoft-com:vml" xmlns:wp14="http://schemas.microsoft.com/office/word/2010/wordprocessingDrawing" xmlns:wp="http://schemas.openxmlformats.org/drawingml/2006/wordprocessingDrawing" xmlns:w10="urn:schemas-microsoft-com:office:word" xmlns:w="http://schemas.openxmlformats.org/wordprocessingml/2006/main" xmlns:w14="http://schemas.microsoft.com/office/word/2010/wordml" xmlns:w15="http://schemas.microsoft.com/office/word/2012/wordml" xmlns:w16cex="http://schemas.microsoft.com/office/word/2018/wordml/cex" xmlns:w16cid="http://schemas.microsoft.com/office/word/2016/wordml/cid" xmlns:w16="http://schemas.microsoft.com/office/word/2018/wordml" xmlns:w16du="http://schemas.microsoft.com/office/word/2023/wordml/word16du" xmlns:w16sdtdh="http://schemas.microsoft.com/office/word/2020/wordml/sdtdatahash" xmlns:w16sdtfl="http://schemas.microsoft.com/office/word/2024/wordml/sdtformatlock" xmlns:w16se="http://schemas.microsoft.com/office/word/2015/wordml/symex" xmlns:wpg="http://schemas.microsoft.com/office/word/2010/wordprocessingGroup" xmlns:wpi="http://schemas.microsoft.com/office/word/2010/wordprocessingInk" xmlns:wne="http://schemas.microsoft.com/office/word/2006/wordml" xmlns:wps="http://schemas.microsoft.com/office/word/2010/wordprocessingShape" mc:Ignorable="w14 w15 w16se w16cid w16 w16cex w16sdtdh w16sdtfl w16du wp14">
   <w:endnote w:type="separator" w:id="-1">
     <w:p>
       <w:r>
@@ -35299,7 +35554,7 @@
 </file>
 
 <file path=word/footer1.xml><?xml version="1.0" encoding="utf-8"?>
-<w:ftr xmlns:wpc="http://schemas.microsoft.com/office/word/2010/wordprocessingCanvas" xmlns:cx="http://schemas.microsoft.com/office/drawing/2014/chartex" xmlns:cx1="http://schemas.microsoft.com/office/drawing/2015/9/8/chartex" xmlns:cx2="http://schemas.microsoft.com/office/drawing/2015/10/21/chartex" xmlns:cx3="http://schemas.microsoft.com/office/drawing/2016/5/9/chartex" xmlns:cx4="http://schemas.microsoft.com/office/drawing/2016/5/10/chartex" xmlns:cx5="http://schemas.microsoft.com/office/drawing/2016/5/11/chartex" xmlns:cx6="http://schemas.microsoft.com/office/drawing/2016/5/12/chartex" xmlns:cx7="http://schemas.microsoft.com/office/drawing/2016/5/13/chartex" xmlns:cx8="http://schemas.microsoft.com/office/drawing/2016/5/14/chartex" xmlns:mc="http://schemas.openxmlformats.org/markup-compatibility/2006" xmlns:aink="http://schemas.microsoft.com/office/drawing/2016/ink" xmlns:am3d="http://schemas.microsoft.com/office/drawing/2017/model3d" xmlns:o="urn:schemas-microsoft-com:office:office" xmlns:r="http://schemas.openxmlformats.org/officeDocument/2006/relationships" xmlns:m="http://schemas.openxmlformats.org/officeDocument/2006/math" xmlns:v="urn:schemas-microsoft-com:vml" xmlns:wp14="http://schemas.microsoft.com/office/word/2010/wordprocessingDrawing" xmlns:wp="http://schemas.openxmlformats.org/drawingml/2006/wordprocessingDrawing" xmlns:w10="urn:schemas-microsoft-com:office:word" xmlns:w="http://schemas.openxmlformats.org/wordprocessingml/2006/main" xmlns:w14="http://schemas.microsoft.com/office/word/2010/wordml" xmlns:w15="http://schemas.microsoft.com/office/word/2012/wordml" xmlns:w16cid="http://schemas.microsoft.com/office/word/2016/wordml/cid" xmlns:w16se="http://schemas.microsoft.com/office/word/2015/wordml/symex" xmlns:wpg="http://schemas.microsoft.com/office/word/2010/wordprocessingGroup" xmlns:wpi="http://schemas.microsoft.com/office/word/2010/wordprocessingInk" xmlns:wne="http://schemas.microsoft.com/office/word/2006/wordml" xmlns:wps="http://schemas.microsoft.com/office/word/2010/wordprocessingShape" mc:Ignorable="w14 w15 w16se w16cid wp14">
+<w:ftr xmlns:wpc="http://schemas.microsoft.com/office/word/2010/wordprocessingCanvas" xmlns:cx="http://schemas.microsoft.com/office/drawing/2014/chartex" xmlns:cx1="http://schemas.microsoft.com/office/drawing/2015/9/8/chartex" xmlns:cx2="http://schemas.microsoft.com/office/drawing/2015/10/21/chartex" xmlns:cx3="http://schemas.microsoft.com/office/drawing/2016/5/9/chartex" xmlns:cx4="http://schemas.microsoft.com/office/drawing/2016/5/10/chartex" xmlns:cx5="http://schemas.microsoft.com/office/drawing/2016/5/11/chartex" xmlns:cx6="http://schemas.microsoft.com/office/drawing/2016/5/12/chartex" xmlns:cx7="http://schemas.microsoft.com/office/drawing/2016/5/13/chartex" xmlns:cx8="http://schemas.microsoft.com/office/drawing/2016/5/14/chartex" xmlns:mc="http://schemas.openxmlformats.org/markup-compatibility/2006" xmlns:aink="http://schemas.microsoft.com/office/drawing/2016/ink" xmlns:am3d="http://schemas.microsoft.com/office/drawing/2017/model3d" xmlns:o="urn:schemas-microsoft-com:office:office" xmlns:oel="http://schemas.microsoft.com/office/2019/extlst" xmlns:r="http://schemas.openxmlformats.org/officeDocument/2006/relationships" xmlns:m="http://schemas.openxmlformats.org/officeDocument/2006/math" xmlns:v="urn:schemas-microsoft-com:vml" xmlns:wp14="http://schemas.microsoft.com/office/word/2010/wordprocessingDrawing" xmlns:wp="http://schemas.openxmlformats.org/drawingml/2006/wordprocessingDrawing" xmlns:w10="urn:schemas-microsoft-com:office:word" xmlns:w="http://schemas.openxmlformats.org/wordprocessingml/2006/main" xmlns:w14="http://schemas.microsoft.com/office/word/2010/wordml" xmlns:w15="http://schemas.microsoft.com/office/word/2012/wordml" xmlns:w16cex="http://schemas.microsoft.com/office/word/2018/wordml/cex" xmlns:w16cid="http://schemas.microsoft.com/office/word/2016/wordml/cid" xmlns:w16="http://schemas.microsoft.com/office/word/2018/wordml" xmlns:w16du="http://schemas.microsoft.com/office/word/2023/wordml/word16du" xmlns:w16sdtdh="http://schemas.microsoft.com/office/word/2020/wordml/sdtdatahash" xmlns:w16sdtfl="http://schemas.microsoft.com/office/word/2024/wordml/sdtformatlock" xmlns:w16se="http://schemas.microsoft.com/office/word/2015/wordml/symex" xmlns:wpg="http://schemas.microsoft.com/office/word/2010/wordprocessingGroup" xmlns:wpi="http://schemas.microsoft.com/office/word/2010/wordprocessingInk" xmlns:wne="http://schemas.microsoft.com/office/word/2006/wordml" xmlns:wps="http://schemas.microsoft.com/office/word/2010/wordprocessingShape" mc:Ignorable="w14 w15 w16se w16cid w16 w16cex w16sdtdh w16sdtfl w16du wp14">
   <w:sdt>
     <w:sdtPr>
       <w:id w:val="-94096170"/>
@@ -35308,7 +35563,6 @@
         <w:docPartUnique/>
       </w:docPartObj>
     </w:sdtPr>
-    <w:sdtEndPr/>
     <w:sdtContent>
       <w:p>
         <w:pPr>
@@ -35345,7 +35599,7 @@
 </file>
 
 <file path=word/footnotes.xml><?xml version="1.0" encoding="utf-8"?>
-<w:footnotes xmlns:wpc="http://schemas.microsoft.com/office/word/2010/wordprocessingCanvas" xmlns:cx="http://schemas.microsoft.com/office/drawing/2014/chartex" xmlns:cx1="http://schemas.microsoft.com/office/drawing/2015/9/8/chartex" xmlns:cx2="http://schemas.microsoft.com/office/drawing/2015/10/21/chartex" xmlns:cx3="http://schemas.microsoft.com/office/drawing/2016/5/9/chartex" xmlns:cx4="http://schemas.microsoft.com/office/drawing/2016/5/10/chartex" xmlns:cx5="http://schemas.microsoft.com/office/drawing/2016/5/11/chartex" xmlns:cx6="http://schemas.microsoft.com/office/drawing/2016/5/12/chartex" xmlns:cx7="http://schemas.microsoft.com/office/drawing/2016/5/13/chartex" xmlns:cx8="http://schemas.microsoft.com/office/drawing/2016/5/14/chartex" xmlns:mc="http://schemas.openxmlformats.org/markup-compatibility/2006" xmlns:aink="http://schemas.microsoft.com/office/drawing/2016/ink" xmlns:am3d="http://schemas.microsoft.com/office/drawing/2017/model3d" xmlns:o="urn:schemas-microsoft-com:office:office" xmlns:r="http://schemas.openxmlformats.org/officeDocument/2006/relationships" xmlns:m="http://schemas.openxmlformats.org/officeDocument/2006/math" xmlns:v="urn:schemas-microsoft-com:vml" xmlns:wp14="http://schemas.microsoft.com/office/word/2010/wordprocessingDrawing" xmlns:wp="http://schemas.openxmlformats.org/drawingml/2006/wordprocessingDrawing" xmlns:w10="urn:schemas-microsoft-com:office:word" xmlns:w="http://schemas.openxmlformats.org/wordprocessingml/2006/main" xmlns:w14="http://schemas.microsoft.com/office/word/2010/wordml" xmlns:w15="http://schemas.microsoft.com/office/word/2012/wordml" xmlns:w16cid="http://schemas.microsoft.com/office/word/2016/wordml/cid" xmlns:w16se="http://schemas.microsoft.com/office/word/2015/wordml/symex" xmlns:wpg="http://schemas.microsoft.com/office/word/2010/wordprocessingGroup" xmlns:wpi="http://schemas.microsoft.com/office/word/2010/wordprocessingInk" xmlns:wne="http://schemas.microsoft.com/office/word/2006/wordml" xmlns:wps="http://schemas.microsoft.com/office/word/2010/wordprocessingShape" mc:Ignorable="w14 w15 w16se w16cid wp14">
+<w:footnotes xmlns:wpc="http://schemas.microsoft.com/office/word/2010/wordprocessingCanvas" xmlns:cx="http://schemas.microsoft.com/office/drawing/2014/chartex" xmlns:cx1="http://schemas.microsoft.com/office/drawing/2015/9/8/chartex" xmlns:cx2="http://schemas.microsoft.com/office/drawing/2015/10/21/chartex" xmlns:cx3="http://schemas.microsoft.com/office/drawing/2016/5/9/chartex" xmlns:cx4="http://schemas.microsoft.com/office/drawing/2016/5/10/chartex" xmlns:cx5="http://schemas.microsoft.com/office/drawing/2016/5/11/chartex" xmlns:cx6="http://schemas.microsoft.com/office/drawing/2016/5/12/chartex" xmlns:cx7="http://schemas.microsoft.com/office/drawing/2016/5/13/chartex" xmlns:cx8="http://schemas.microsoft.com/office/drawing/2016/5/14/chartex" xmlns:mc="http://schemas.openxmlformats.org/markup-compatibility/2006" xmlns:aink="http://schemas.microsoft.com/office/drawing/2016/ink" xmlns:am3d="http://schemas.microsoft.com/office/drawing/2017/model3d" xmlns:o="urn:schemas-microsoft-com:office:office" xmlns:oel="http://schemas.microsoft.com/office/2019/extlst" xmlns:r="http://schemas.openxmlformats.org/officeDocument/2006/relationships" xmlns:m="http://schemas.openxmlformats.org/officeDocument/2006/math" xmlns:v="urn:schemas-microsoft-com:vml" xmlns:wp14="http://schemas.microsoft.com/office/word/2010/wordprocessingDrawing" xmlns:wp="http://schemas.openxmlformats.org/drawingml/2006/wordprocessingDrawing" xmlns:w10="urn:schemas-microsoft-com:office:word" xmlns:w="http://schemas.openxmlformats.org/wordprocessingml/2006/main" xmlns:w14="http://schemas.microsoft.com/office/word/2010/wordml" xmlns:w15="http://schemas.microsoft.com/office/word/2012/wordml" xmlns:w16cex="http://schemas.microsoft.com/office/word/2018/wordml/cex" xmlns:w16cid="http://schemas.microsoft.com/office/word/2016/wordml/cid" xmlns:w16="http://schemas.microsoft.com/office/word/2018/wordml" xmlns:w16du="http://schemas.microsoft.com/office/word/2023/wordml/word16du" xmlns:w16sdtdh="http://schemas.microsoft.com/office/word/2020/wordml/sdtdatahash" xmlns:w16sdtfl="http://schemas.microsoft.com/office/word/2024/wordml/sdtformatlock" xmlns:w16se="http://schemas.microsoft.com/office/word/2015/wordml/symex" xmlns:wpg="http://schemas.microsoft.com/office/word/2010/wordprocessingGroup" xmlns:wpi="http://schemas.microsoft.com/office/word/2010/wordprocessingInk" xmlns:wne="http://schemas.microsoft.com/office/word/2006/wordml" xmlns:wps="http://schemas.microsoft.com/office/word/2010/wordprocessingShape" mc:Ignorable="w14 w15 w16se w16cid w16 w16cex w16sdtdh w16sdtfl w16du wp14">
   <w:footnote w:type="separator" w:id="-1">
     <w:p>
       <w:r>
@@ -35364,7 +35618,7 @@
 </file>
 
 <file path=word/numbering.xml><?xml version="1.0" encoding="utf-8"?>
-<w:numbering xmlns:wpc="http://schemas.microsoft.com/office/word/2010/wordprocessingCanvas" xmlns:cx="http://schemas.microsoft.com/office/drawing/2014/chartex" xmlns:cx1="http://schemas.microsoft.com/office/drawing/2015/9/8/chartex" xmlns:cx2="http://schemas.microsoft.com/office/drawing/2015/10/21/chartex" xmlns:cx3="http://schemas.microsoft.com/office/drawing/2016/5/9/chartex" xmlns:cx4="http://schemas.microsoft.com/office/drawing/2016/5/10/chartex" xmlns:cx5="http://schemas.microsoft.com/office/drawing/2016/5/11/chartex" xmlns:cx6="http://schemas.microsoft.com/office/drawing/2016/5/12/chartex" xmlns:cx7="http://schemas.microsoft.com/office/drawing/2016/5/13/chartex" xmlns:cx8="http://schemas.microsoft.com/office/drawing/2016/5/14/chartex" xmlns:mc="http://schemas.openxmlformats.org/markup-compatibility/2006" xmlns:aink="http://schemas.microsoft.com/office/drawing/2016/ink" xmlns:am3d="http://schemas.microsoft.com/office/drawing/2017/model3d" xmlns:o="urn:schemas-microsoft-com:office:office" xmlns:r="http://schemas.openxmlformats.org/officeDocument/2006/relationships" xmlns:m="http://schemas.openxmlformats.org/officeDocument/2006/math" xmlns:v="urn:schemas-microsoft-com:vml" xmlns:wp14="http://schemas.microsoft.com/office/word/2010/wordprocessingDrawing" xmlns:wp="http://schemas.openxmlformats.org/drawingml/2006/wordprocessingDrawing" xmlns:w10="urn:schemas-microsoft-com:office:word" xmlns:w="http://schemas.openxmlformats.org/wordprocessingml/2006/main" xmlns:w14="http://schemas.microsoft.com/office/word/2010/wordml" xmlns:w15="http://schemas.microsoft.com/office/word/2012/wordml" xmlns:w16cid="http://schemas.microsoft.com/office/word/2016/wordml/cid" xmlns:w16se="http://schemas.microsoft.com/office/word/2015/wordml/symex" xmlns:wpg="http://schemas.microsoft.com/office/word/2010/wordprocessingGroup" xmlns:wpi="http://schemas.microsoft.com/office/word/2010/wordprocessingInk" xmlns:wne="http://schemas.microsoft.com/office/word/2006/wordml" xmlns:wps="http://schemas.microsoft.com/office/word/2010/wordprocessingShape" mc:Ignorable="w14 w15 w16se w16cid wp14">
+<w:numbering xmlns:wpc="http://schemas.microsoft.com/office/word/2010/wordprocessingCanvas" xmlns:cx="http://schemas.microsoft.com/office/drawing/2014/chartex" xmlns:cx1="http://schemas.microsoft.com/office/drawing/2015/9/8/chartex" xmlns:cx2="http://schemas.microsoft.com/office/drawing/2015/10/21/chartex" xmlns:cx3="http://schemas.microsoft.com/office/drawing/2016/5/9/chartex" xmlns:cx4="http://schemas.microsoft.com/office/drawing/2016/5/10/chartex" xmlns:cx5="http://schemas.microsoft.com/office/drawing/2016/5/11/chartex" xmlns:cx6="http://schemas.microsoft.com/office/drawing/2016/5/12/chartex" xmlns:cx7="http://schemas.microsoft.com/office/drawing/2016/5/13/chartex" xmlns:cx8="http://schemas.microsoft.com/office/drawing/2016/5/14/chartex" xmlns:mc="http://schemas.openxmlformats.org/markup-compatibility/2006" xmlns:aink="http://schemas.microsoft.com/office/drawing/2016/ink" xmlns:am3d="http://schemas.microsoft.com/office/drawing/2017/model3d" xmlns:o="urn:schemas-microsoft-com:office:office" xmlns:oel="http://schemas.microsoft.com/office/2019/extlst" xmlns:r="http://schemas.openxmlformats.org/officeDocument/2006/relationships" xmlns:m="http://schemas.openxmlformats.org/officeDocument/2006/math" xmlns:v="urn:schemas-microsoft-com:vml" xmlns:wp14="http://schemas.microsoft.com/office/word/2010/wordprocessingDrawing" xmlns:wp="http://schemas.openxmlformats.org/drawingml/2006/wordprocessingDrawing" xmlns:w10="urn:schemas-microsoft-com:office:word" xmlns:w="http://schemas.openxmlformats.org/wordprocessingml/2006/main" xmlns:w14="http://schemas.microsoft.com/office/word/2010/wordml" xmlns:w15="http://schemas.microsoft.com/office/word/2012/wordml" xmlns:w16cex="http://schemas.microsoft.com/office/word/2018/wordml/cex" xmlns:w16cid="http://schemas.microsoft.com/office/word/2016/wordml/cid" xmlns:w16="http://schemas.microsoft.com/office/word/2018/wordml" xmlns:w16du="http://schemas.microsoft.com/office/word/2023/wordml/word16du" xmlns:w16sdtdh="http://schemas.microsoft.com/office/word/2020/wordml/sdtdatahash" xmlns:w16sdtfl="http://schemas.microsoft.com/office/word/2024/wordml/sdtformatlock" xmlns:w16se="http://schemas.microsoft.com/office/word/2015/wordml/symex" xmlns:wpg="http://schemas.microsoft.com/office/word/2010/wordprocessingGroup" xmlns:wpi="http://schemas.microsoft.com/office/word/2010/wordprocessingInk" xmlns:wne="http://schemas.microsoft.com/office/word/2006/wordml" xmlns:wps="http://schemas.microsoft.com/office/word/2010/wordprocessingShape" mc:Ignorable="w14 w15 w16se w16cid w16 w16cex w16sdtdh w16sdtfl w16du wp14">
   <w:abstractNum w:abstractNumId="0" w15:restartNumberingAfterBreak="0">
     <w:nsid w:val="05134AAF"/>
     <w:multiLevelType w:val="hybridMultilevel"/>
@@ -36699,50 +36953,50 @@
       </w:rPr>
     </w:lvl>
   </w:abstractNum>
-  <w:num w:numId="1">
+  <w:num w:numId="1" w16cid:durableId="950280538">
     <w:abstractNumId w:val="7"/>
   </w:num>
-  <w:num w:numId="2">
+  <w:num w:numId="2" w16cid:durableId="167794524">
     <w:abstractNumId w:val="8"/>
   </w:num>
-  <w:num w:numId="3">
+  <w:num w:numId="3" w16cid:durableId="1575049227">
     <w:abstractNumId w:val="5"/>
   </w:num>
-  <w:num w:numId="4">
+  <w:num w:numId="4" w16cid:durableId="129326487">
     <w:abstractNumId w:val="11"/>
   </w:num>
-  <w:num w:numId="5">
+  <w:num w:numId="5" w16cid:durableId="134421633">
     <w:abstractNumId w:val="9"/>
   </w:num>
-  <w:num w:numId="6">
+  <w:num w:numId="6" w16cid:durableId="670331462">
     <w:abstractNumId w:val="1"/>
   </w:num>
-  <w:num w:numId="7">
+  <w:num w:numId="7" w16cid:durableId="1467699888">
     <w:abstractNumId w:val="2"/>
   </w:num>
-  <w:num w:numId="8">
+  <w:num w:numId="8" w16cid:durableId="1572889096">
     <w:abstractNumId w:val="10"/>
   </w:num>
-  <w:num w:numId="9">
+  <w:num w:numId="9" w16cid:durableId="1501190101">
     <w:abstractNumId w:val="6"/>
   </w:num>
-  <w:num w:numId="10">
+  <w:num w:numId="10" w16cid:durableId="1811551729">
     <w:abstractNumId w:val="0"/>
   </w:num>
-  <w:num w:numId="11">
+  <w:num w:numId="11" w16cid:durableId="738673780">
     <w:abstractNumId w:val="4"/>
   </w:num>
-  <w:num w:numId="12">
+  <w:num w:numId="12" w16cid:durableId="613635317">
     <w:abstractNumId w:val="3"/>
   </w:num>
-  <w:num w:numId="13">
+  <w:num w:numId="13" w16cid:durableId="1695037964">
     <w:abstractNumId w:val="12"/>
   </w:num>
 </w:numbering>
 </file>
 
 <file path=word/styles.xml><?xml version="1.0" encoding="utf-8"?>
-<w:styles xmlns:mc="http://schemas.openxmlformats.org/markup-compatibility/2006" xmlns:r="http://schemas.openxmlformats.org/officeDocument/2006/relationships" xmlns:w="http://schemas.openxmlformats.org/wordprocessingml/2006/main" xmlns:w14="http://schemas.microsoft.com/office/word/2010/wordml" xmlns:w15="http://schemas.microsoft.com/office/word/2012/wordml" xmlns:w16cid="http://schemas.microsoft.com/office/word/2016/wordml/cid" xmlns:w16se="http://schemas.microsoft.com/office/word/2015/wordml/symex" mc:Ignorable="w14 w15 w16se w16cid">
+<w:styles xmlns:mc="http://schemas.openxmlformats.org/markup-compatibility/2006" xmlns:r="http://schemas.openxmlformats.org/officeDocument/2006/relationships" xmlns:w="http://schemas.openxmlformats.org/wordprocessingml/2006/main" xmlns:w14="http://schemas.microsoft.com/office/word/2010/wordml" xmlns:w15="http://schemas.microsoft.com/office/word/2012/wordml" xmlns:w16cex="http://schemas.microsoft.com/office/word/2018/wordml/cex" xmlns:w16cid="http://schemas.microsoft.com/office/word/2016/wordml/cid" xmlns:w16="http://schemas.microsoft.com/office/word/2018/wordml" xmlns:w16du="http://schemas.microsoft.com/office/word/2023/wordml/word16du" xmlns:w16sdtdh="http://schemas.microsoft.com/office/word/2020/wordml/sdtdatahash" xmlns:w16sdtfl="http://schemas.microsoft.com/office/word/2024/wordml/sdtformatlock" xmlns:w16se="http://schemas.microsoft.com/office/word/2015/wordml/symex" mc:Ignorable="w14 w15 w16se w16cid w16 w16cex w16sdtdh w16sdtfl w16du">
   <w:docDefaults>
     <w:rPrDefault>
       <w:rPr>
@@ -36755,7 +37009,7 @@
     </w:rPrDefault>
     <w:pPrDefault/>
   </w:docDefaults>
-  <w:latentStyles w:defLockedState="0" w:defUIPriority="99" w:defSemiHidden="0" w:defUnhideWhenUsed="0" w:defQFormat="0" w:count="375">
+  <w:latentStyles w:defLockedState="0" w:defUIPriority="99" w:defSemiHidden="0" w:defUnhideWhenUsed="0" w:defQFormat="0" w:count="376">
     <w:lsdException w:name="Normal" w:uiPriority="0" w:qFormat="1"/>
     <w:lsdException w:name="heading 1" w:uiPriority="9" w:qFormat="1"/>
     <w:lsdException w:name="heading 2" w:semiHidden="1" w:uiPriority="9" w:unhideWhenUsed="1" w:qFormat="1"/>
@@ -37131,6 +37385,7 @@
     <w:lsdException w:name="Smart Hyperlink" w:semiHidden="1" w:unhideWhenUsed="1"/>
     <w:lsdException w:name="Hashtag" w:semiHidden="1" w:unhideWhenUsed="1"/>
     <w:lsdException w:name="Unresolved Mention" w:semiHidden="1" w:unhideWhenUsed="1"/>
+    <w:lsdException w:name="Smart Link" w:semiHidden="1" w:unhideWhenUsed="1"/>
   </w:latentStyles>
   <w:style w:type="paragraph" w:default="1" w:styleId="a">
     <w:name w:val="Normal"/>

</xml_diff>